<commit_message>
Add Ono Academic College logo to assignment cover page
Co-Authored-By: Claude Fable 5 <noreply@anthropic.com>
Claude-Session: https://claude.ai/code/session_015K8btXvKJY24mp6rz82VWm
</commit_message>
<xml_diff>
--- a/עבודת גמר - דיני עבודה.docx
+++ b/עבודת גמר - דיני עבודה.docx
@@ -4,8 +4,54 @@
   <w:body>
     <w:p>
       <w:pPr>
-        <w:bidi/>
-        <w:spacing w:after="120" w:before="1200" w:line="360"/>
+        <w:spacing w:after="240" w:before="600"/>
+        <w:jc w:val="center"/>
+      </w:pPr>
+      <w:r>
+        <w:drawing>
+          <wp:inline distT="0" distB="0" distL="0" distR="0">
+            <wp:extent cx="1428750" cy="1428750"/>
+            <wp:effectExtent t="0" r="0" b="0" l="0"/>
+            <wp:docPr id="1" name="" descr="" title=""/>
+            <wp:cNvGraphicFramePr>
+              <a:graphicFrameLocks xmlns:a="http://schemas.openxmlformats.org/drawingml/2006/main" noChangeAspect="1"/>
+            </wp:cNvGraphicFramePr>
+            <a:graphic xmlns:a="http://schemas.openxmlformats.org/drawingml/2006/main">
+              <a:graphicData uri="http://schemas.openxmlformats.org/drawingml/2006/picture">
+                <pic:pic xmlns:pic="http://schemas.openxmlformats.org/drawingml/2006/picture">
+                  <pic:nvPicPr>
+                    <pic:cNvPr id="0" name="" descr=""/>
+                    <pic:cNvPicPr>
+                      <a:picLocks noChangeAspect="1" noChangeArrowheads="1"/>
+                    </pic:cNvPicPr>
+                  </pic:nvPicPr>
+                  <pic:blipFill>
+                    <a:blip r:embed="rId7" cstate="none"/>
+                    <a:srcRect/>
+                    <a:stretch>
+                      <a:fillRect/>
+                    </a:stretch>
+                  </pic:blipFill>
+                  <pic:spPr bwMode="auto">
+                    <a:xfrm>
+                      <a:off x="0" y="0"/>
+                      <a:ext cx="1428750" cy="1428750"/>
+                    </a:xfrm>
+                    <a:prstGeom prst="rect">
+                      <a:avLst/>
+                    </a:prstGeom>
+                  </pic:spPr>
+                </pic:pic>
+              </a:graphicData>
+            </a:graphic>
+          </wp:inline>
+        </w:drawing>
+      </w:r>
+    </w:p>
+    <w:p>
+      <w:pPr>
+        <w:bidi/>
+        <w:spacing w:after="120" w:before="120" w:line="360"/>
         <w:jc w:val="center"/>
       </w:pPr>
       <w:r>

</xml_diff>

<commit_message>
Fill student name and ID on assignment cover page
Co-Authored-By: Claude Fable 5 <noreply@anthropic.com>
Claude-Session: https://claude.ai/code/session_015K8btXvKJY24mp6rz82VWm
</commit_message>
<xml_diff>
--- a/עבודת גמר - דיני עבודה.docx
+++ b/עבודת גמר - דיני עבודה.docx
@@ -207,7 +207,7 @@
           <w:szCs w:val="24"/>
           <w:rtl/>
         </w:rPr>
-        <w:t xml:space="preserve">שם הסטודנט: ____________________</w:t>
+        <w:t xml:space="preserve">שם הסטודנט: יונס עומר</w:t>
       </w:r>
     </w:p>
     <w:p>
@@ -225,7 +225,7 @@
           <w:szCs w:val="24"/>
           <w:rtl/>
         </w:rPr>
-        <w:t xml:space="preserve">ת"ז: ____________________</w:t>
+        <w:t xml:space="preserve">ת.ז.: 213758246</w:t>
       </w:r>
     </w:p>
     <w:p>

</xml_diff>